<commit_message>
Update: replace placeholder URLs with actual GitHub repo URL
https://github.com/lensetek/idx-panel-data-descriptor

Co-Authored-By: Claude <noreply@anthropic.com>
</commit_message>
<xml_diff>
--- a/draft_manuscript.docx
+++ b/draft_manuscript.docx
@@ -821,7 +821,7 @@
         <w:jc w:val="both"/>
       </w:pPr>
       <w:r>
-        <w:t xml:space="preserve">All acquisition and preprocessing scripts are housed in a GitHub repository (to be deposited at</w:t>
+        <w:t xml:space="preserve">All acquisition and preprocessing scripts are housed in a GitHub repository (deposited at</w:t>
       </w:r>
       <w:r>
         <w:t xml:space="preserve"> </w:t>
@@ -831,7 +831,7 @@
           <w:rPr>
             <w:rStyle w:val="Hyperlink"/>
           </w:rPr>
-          <w:t xml:space="preserve">https://github.com/[user]/idx-panel-dataset</w:t>
+          <w:t xml:space="preserve">https://github.com/lensetek/idx-panel-data-descriptor</w:t>
         </w:r>
       </w:hyperlink>
       <w:r>
@@ -940,7 +940,18 @@
         <w:jc w:val="both"/>
       </w:pPr>
       <w:r>
-        <w:t xml:space="preserve">The dataset is deposited on Zenodo (DOI [to be assigned upon publication]) under a CC-BY 4.0 licence. The repository includes the following files.</w:t>
+        <w:t xml:space="preserve">The dataset is deposited on Zenodo (DOI [to be assigned upon publication]) under a CC-BY 4.0 licence and the source code is available on GitHub (</w:t>
+      </w:r>
+      <w:hyperlink r:id="rId13">
+        <w:r>
+          <w:rPr>
+            <w:rStyle w:val="Hyperlink"/>
+          </w:rPr>
+          <w:t xml:space="preserve">https://github.com/lensetek/idx-panel-data-descriptor</w:t>
+        </w:r>
+      </w:hyperlink>
+      <w:r>
+        <w:t xml:space="preserve">). The repository includes the following files.</w:t>
       </w:r>
     </w:p>
     <w:bookmarkStart w:id="17" w:name="primary-data-files"/>
@@ -4639,7 +4650,7 @@
           <w:rPr>
             <w:rStyle w:val="Hyperlink"/>
           </w:rPr>
-          <w:t xml:space="preserve">https://github.com/[user]/idx-panel-dataset</w:t>
+          <w:t xml:space="preserve">https://github.com/lensetek/idx-panel-data-descriptor</w:t>
         </w:r>
       </w:hyperlink>
       <w:r>

</xml_diff>

<commit_message>
Add authors: Ali Kesuma, Andy Ismail — Faculty of Business, Universitas Darwan Ali
- ali@unda.ac.id (corresponding), andy@unda.ac.id
- No external funding
- Author contributions added per CRediT taxonomy

Co-Authored-By: Claude <noreply@anthropic.com>
</commit_message>
<xml_diff>
--- a/draft_manuscript.docx
+++ b/draft_manuscript.docx
@@ -31,7 +31,40 @@
         <w:jc w:val="both"/>
       </w:pPr>
       <w:r>
-        <w:t xml:space="preserve">[Authors to be added]</w:t>
+        <w:t xml:space="preserve">Ali Kesuma</w:t>
+      </w:r>
+      <w:r>
+        <w:rPr>
+          <w:vertAlign w:val="superscript"/>
+        </w:rPr>
+        <w:t xml:space="preserve">1</w:t>
+      </w:r>
+      <w:r>
+        <w:rPr>
+          <w:rStyle w:val="FootnoteReference"/>
+        </w:rPr>
+        <w:footnoteReference w:id="9"/>
+      </w:r>
+      <w:r>
+        <w:t xml:space="preserve">,</w:t>
+      </w:r>
+      <w:r>
+        <w:t xml:space="preserve"> </w:t>
+      </w:r>
+      <w:r>
+        <w:t xml:space="preserve">Andy Ismail</w:t>
+      </w:r>
+      <w:r>
+        <w:rPr>
+          <w:vertAlign w:val="superscript"/>
+        </w:rPr>
+        <w:t xml:space="preserve">1</w:t>
+      </w:r>
+      <w:r>
+        <w:rPr>
+          <w:rStyle w:val="FootnoteReference"/>
+        </w:rPr>
+        <w:footnoteReference w:id="10"/>
       </w:r>
     </w:p>
     <w:p>
@@ -132,7 +165,25 @@
         <w:t xml:space="preserve">). The dataset lives on Zenodo under CC-BY 4.0 and ships with a full codebook plus reproducible preprocessing scripts. It plugs a genuine hole: no peer-reviewed, open-access panel data descriptor covering an ASEAN stock exchange currently exists in the scientific record.</w:t>
       </w:r>
     </w:p>
-    <w:bookmarkStart w:id="9" w:name="background-summary"/>
+    <w:p>
+      <w:pPr>
+        <w:pStyle w:val="FirstParagraph"/>
+        <w:jc w:val="both"/>
+      </w:pPr>
+      <w:r>
+        <w:rPr>
+          <w:vertAlign w:val="superscript"/>
+        </w:rPr>
+        <w:t xml:space="preserve">1</w:t>
+      </w:r>
+      <w:r>
+        <w:t xml:space="preserve"> </w:t>
+      </w:r>
+      <w:r>
+        <w:t xml:space="preserve">Faculty of Business, Universitas Darwan Ali, Indonesia</w:t>
+      </w:r>
+    </w:p>
+    <w:bookmarkStart w:id="11" w:name="background-summary"/>
     <w:p>
       <w:pPr>
         <w:pStyle w:val="Heading1"/>
@@ -281,8 +332,8 @@
         <w:t xml:space="preserve">Documentation at the variable level, paired with a literature sweep confirming no comparable open-access dataset has been described before.</w:t>
       </w:r>
     </w:p>
-    <w:bookmarkEnd w:id="9"/>
-    <w:bookmarkStart w:id="15" w:name="methods"/>
+    <w:bookmarkEnd w:id="11"/>
+    <w:bookmarkStart w:id="17" w:name="methods"/>
     <w:p>
       <w:pPr>
         <w:pStyle w:val="Heading1"/>
@@ -292,7 +343,7 @@
         <w:t xml:space="preserve">Methods</w:t>
       </w:r>
     </w:p>
-    <w:bookmarkStart w:id="10" w:name="data-collection"/>
+    <w:bookmarkStart w:id="12" w:name="data-collection"/>
     <w:p>
       <w:pPr>
         <w:pStyle w:val="Heading2"/>
@@ -480,8 +531,8 @@
         <w:t xml:space="preserve">) was downloaded for reference.</w:t>
       </w:r>
     </w:p>
-    <w:bookmarkEnd w:id="10"/>
-    <w:bookmarkStart w:id="12" w:name="preprocessing"/>
+    <w:bookmarkEnd w:id="12"/>
+    <w:bookmarkStart w:id="14" w:name="preprocessing"/>
     <w:p>
       <w:pPr>
         <w:pStyle w:val="Heading2"/>
@@ -748,8 +799,8 @@
         </w:numPr>
         <w:jc w:val="both"/>
       </w:pPr>
-      <w:bookmarkStart w:id="11" w:name="eq:tobinq"/>
-      <w:bookmarkEnd w:id="11"/>
+      <w:bookmarkStart w:id="13" w:name="eq:tobinq"/>
+      <w:bookmarkEnd w:id="13"/>
       <w:r>
         <w:t xml:space="preserve"> </w:t>
       </w:r>
@@ -804,8 +855,8 @@
         <w:t xml:space="preserve">107 firm-year observations drawn from 67 unique tickers.</w:t>
       </w:r>
     </w:p>
-    <w:bookmarkEnd w:id="12"/>
-    <w:bookmarkStart w:id="14" w:name="code-availability"/>
+    <w:bookmarkEnd w:id="14"/>
+    <w:bookmarkStart w:id="16" w:name="code-availability"/>
     <w:p>
       <w:pPr>
         <w:pStyle w:val="Heading2"/>
@@ -826,7 +877,7 @@
       <w:r>
         <w:t xml:space="preserve"> </w:t>
       </w:r>
-      <w:hyperlink r:id="rId13">
+      <w:hyperlink r:id="rId15">
         <w:r>
           <w:rPr>
             <w:rStyle w:val="Hyperlink"/>
@@ -922,9 +973,9 @@
         <w:t xml:space="preserve">.</w:t>
       </w:r>
     </w:p>
-    <w:bookmarkEnd w:id="14"/>
-    <w:bookmarkEnd w:id="15"/>
-    <w:bookmarkStart w:id="22" w:name="data-records"/>
+    <w:bookmarkEnd w:id="16"/>
+    <w:bookmarkEnd w:id="17"/>
+    <w:bookmarkStart w:id="24" w:name="data-records"/>
     <w:p>
       <w:pPr>
         <w:pStyle w:val="Heading1"/>
@@ -942,7 +993,7 @@
       <w:r>
         <w:t xml:space="preserve">The dataset is deposited on Zenodo (DOI [to be assigned upon publication]) under a CC-BY 4.0 licence and the source code is available on GitHub (</w:t>
       </w:r>
-      <w:hyperlink r:id="rId13">
+      <w:hyperlink r:id="rId15">
         <w:r>
           <w:rPr>
             <w:rStyle w:val="Hyperlink"/>
@@ -954,7 +1005,7 @@
         <w:t xml:space="preserve">). The repository includes the following files.</w:t>
       </w:r>
     </w:p>
-    <w:bookmarkStart w:id="17" w:name="primary-data-files"/>
+    <w:bookmarkStart w:id="19" w:name="primary-data-files"/>
     <w:p>
       <w:pPr>
         <w:pStyle w:val="Heading2"/>
@@ -964,7 +1015,7 @@
         <w:t xml:space="preserve">Primary Data Files</w:t>
       </w:r>
     </w:p>
-    <w:bookmarkStart w:id="16" w:name="tab:datafiles"/>
+    <w:bookmarkStart w:id="18" w:name="tab:datafiles"/>
     <w:p>
       <w:pPr>
         <w:pStyle w:val="TableCaption"/>
@@ -1340,9 +1391,9 @@
         </w:tc>
       </w:tr>
     </w:tbl>
-    <w:bookmarkEnd w:id="16"/>
-    <w:bookmarkEnd w:id="17"/>
-    <w:bookmarkStart w:id="19" w:name="documentation-files"/>
+    <w:bookmarkEnd w:id="18"/>
+    <w:bookmarkEnd w:id="19"/>
+    <w:bookmarkStart w:id="21" w:name="documentation-files"/>
     <w:p>
       <w:pPr>
         <w:pStyle w:val="Heading2"/>
@@ -1352,7 +1403,7 @@
         <w:t xml:space="preserve">Documentation Files</w:t>
       </w:r>
     </w:p>
-    <w:bookmarkStart w:id="18" w:name="tab:docfiles"/>
+    <w:bookmarkStart w:id="20" w:name="tab:docfiles"/>
     <w:p>
       <w:pPr>
         <w:pStyle w:val="TableCaption"/>
@@ -1556,9 +1607,9 @@
         </w:tc>
       </w:tr>
     </w:tbl>
-    <w:bookmarkEnd w:id="18"/>
-    <w:bookmarkEnd w:id="19"/>
-    <w:bookmarkStart w:id="21" w:name="variable-definitions-panel-master"/>
+    <w:bookmarkEnd w:id="20"/>
+    <w:bookmarkEnd w:id="21"/>
+    <w:bookmarkStart w:id="23" w:name="variable-definitions-panel-master"/>
     <w:p>
       <w:pPr>
         <w:pStyle w:val="Heading2"/>
@@ -1568,7 +1619,7 @@
         <w:t xml:space="preserve">Variable Definitions (Panel Master)</w:t>
       </w:r>
     </w:p>
-    <w:bookmarkStart w:id="20" w:name="tab:variables"/>
+    <w:bookmarkStart w:id="22" w:name="tab:variables"/>
     <w:p>
       <w:pPr>
         <w:pStyle w:val="TableCaption"/>
@@ -2376,10 +2427,10 @@
         </w:tc>
       </w:tr>
     </w:tbl>
-    <w:bookmarkEnd w:id="20"/>
-    <w:bookmarkEnd w:id="21"/>
     <w:bookmarkEnd w:id="22"/>
-    <w:bookmarkStart w:id="35" w:name="technical-validation"/>
+    <w:bookmarkEnd w:id="23"/>
+    <w:bookmarkEnd w:id="24"/>
+    <w:bookmarkStart w:id="37" w:name="technical-validation"/>
     <w:p>
       <w:pPr>
         <w:pStyle w:val="Heading1"/>
@@ -2401,7 +2452,7 @@
         <w:t xml:space="preserve">. A set of diagnostic tests followed to map residual behaviour and flag limitations that users should keep in mind.</w:t>
       </w:r>
     </w:p>
-    <w:bookmarkStart w:id="24" w:name="regression-specification"/>
+    <w:bookmarkStart w:id="26" w:name="regression-specification"/>
     <w:p>
       <w:pPr>
         <w:pStyle w:val="Heading2"/>
@@ -2604,8 +2655,8 @@
         <w:pStyle w:val="FirstParagraph"/>
         <w:jc w:val="both"/>
       </w:pPr>
-      <w:bookmarkStart w:id="23" w:name="eq:ols"/>
-      <w:bookmarkEnd w:id="23"/>
+      <w:bookmarkStart w:id="25" w:name="eq:ols"/>
+      <w:bookmarkEnd w:id="25"/>
     </w:p>
     <w:p>
       <w:pPr>
@@ -2630,8 +2681,8 @@
         <w:t xml:space="preserve">is proxied by the price-to-book ratio. Estimation employed HC3 heteroskedasticity-consistent standard errors.</w:t>
       </w:r>
     </w:p>
-    <w:bookmarkEnd w:id="24"/>
-    <w:bookmarkStart w:id="26" w:name="results"/>
+    <w:bookmarkEnd w:id="26"/>
+    <w:bookmarkStart w:id="28" w:name="results"/>
     <w:p>
       <w:pPr>
         <w:pStyle w:val="Heading2"/>
@@ -2641,7 +2692,7 @@
         <w:t xml:space="preserve">Results</w:t>
       </w:r>
     </w:p>
-    <w:bookmarkStart w:id="25" w:name="tab:ols"/>
+    <w:bookmarkStart w:id="27" w:name="tab:ols"/>
     <w:p>
       <w:pPr>
         <w:pStyle w:val="TableCaption"/>
@@ -3339,7 +3390,7 @@
         </w:tc>
       </w:tr>
     </w:tbl>
-    <w:bookmarkEnd w:id="25"/>
+    <w:bookmarkEnd w:id="27"/>
     <w:p>
       <w:pPr>
         <w:pStyle w:val="BodyText"/>
@@ -3381,8 +3432,8 @@
         <w:t xml:space="preserve">.</w:t>
       </w:r>
     </w:p>
-    <w:bookmarkEnd w:id="26"/>
-    <w:bookmarkStart w:id="28" w:name="diagnostic-tests"/>
+    <w:bookmarkEnd w:id="28"/>
+    <w:bookmarkStart w:id="30" w:name="diagnostic-tests"/>
     <w:p>
       <w:pPr>
         <w:pStyle w:val="Heading2"/>
@@ -3392,7 +3443,7 @@
         <w:t xml:space="preserve">Diagnostic Tests</w:t>
       </w:r>
     </w:p>
-    <w:bookmarkStart w:id="27" w:name="tab:diag"/>
+    <w:bookmarkStart w:id="29" w:name="tab:diag"/>
     <w:p>
       <w:pPr>
         <w:pStyle w:val="TableCaption"/>
@@ -3862,9 +3913,9 @@
         </w:tc>
       </w:tr>
     </w:tbl>
-    <w:bookmarkEnd w:id="27"/>
-    <w:bookmarkEnd w:id="28"/>
-    <w:bookmarkStart w:id="29" w:name="robustness-checks"/>
+    <w:bookmarkEnd w:id="29"/>
+    <w:bookmarkEnd w:id="30"/>
+    <w:bookmarkStart w:id="31" w:name="robustness-checks"/>
     <w:p>
       <w:pPr>
         <w:pStyle w:val="Heading2"/>
@@ -3948,8 +3999,8 @@
         <w:t xml:space="preserve">: Residuals vary noticeably by sector. Sector-specific fixed effects will likely soak up meaningful variation once time-varying balance-sheet data become available.</w:t>
       </w:r>
     </w:p>
-    <w:bookmarkEnd w:id="29"/>
-    <w:bookmarkStart w:id="32" w:name="known-limitations-v1"/>
+    <w:bookmarkEnd w:id="31"/>
+    <w:bookmarkStart w:id="34" w:name="known-limitations-v1"/>
     <w:p>
       <w:pPr>
         <w:pStyle w:val="Heading2"/>
@@ -4034,7 +4085,7 @@
       <w:r>
         <w:t xml:space="preserve">: BI Rate, inflation, GDP growth, and exchange-rate series are deferred to v2. They can be sourced from BI (</w:t>
       </w:r>
-      <w:hyperlink r:id="rId30">
+      <w:hyperlink r:id="rId32">
         <w:r>
           <w:rPr>
             <w:rStyle w:val="Hyperlink"/>
@@ -4045,7 +4096,7 @@
       <w:r>
         <w:t xml:space="preserve">) and BPS (</w:t>
       </w:r>
-      <w:hyperlink r:id="rId31">
+      <w:hyperlink r:id="rId33">
         <w:r>
           <w:rPr>
             <w:rStyle w:val="Hyperlink"/>
@@ -4057,8 +4108,8 @@
         <w:t xml:space="preserve">).</w:t>
       </w:r>
     </w:p>
-    <w:bookmarkEnd w:id="32"/>
-    <w:bookmarkStart w:id="33" w:name="panel-model-limitations"/>
+    <w:bookmarkEnd w:id="34"/>
+    <w:bookmarkStart w:id="35" w:name="panel-model-limitations"/>
     <w:p>
       <w:pPr>
         <w:pStyle w:val="Heading2"/>
@@ -4077,8 +4128,8 @@
         <w:t xml:space="preserve">Because v1 draws its financial ratios from a single point-in-time snapshot, within-firm variation never enters the picture. Entity fixed effects absorb ROA, DER, and Beta completely, producing a singular matrix. Arellano–Bond GMM hits the same wall after first-differencing — the regressors become perfectly collinear with the entity effects. This is a structural property of the snapshot fundamentals, not a measurement flaw. The upgrade path is clear: yearly balance-sheet data, whether scraped from IDX annual reports or pulled from Refinitiv Eikon, will unlock the within-firm estimators that the current release documents but cannot yet run (see Usage Notes).</w:t>
       </w:r>
     </w:p>
-    <w:bookmarkEnd w:id="33"/>
-    <w:bookmarkStart w:id="34" w:name="sharia-classification-method"/>
+    <w:bookmarkEnd w:id="35"/>
+    <w:bookmarkStart w:id="36" w:name="sharia-classification-method"/>
     <w:p>
       <w:pPr>
         <w:pStyle w:val="Heading2"/>
@@ -4100,9 +4151,9 @@
         <w:t xml:space="preserve">; v2 will adopt the same approach.</w:t>
       </w:r>
     </w:p>
-    <w:bookmarkEnd w:id="34"/>
-    <w:bookmarkEnd w:id="35"/>
-    <w:bookmarkStart w:id="40" w:name="usage-notes"/>
+    <w:bookmarkEnd w:id="36"/>
+    <w:bookmarkEnd w:id="37"/>
+    <w:bookmarkStart w:id="42" w:name="usage-notes"/>
     <w:p>
       <w:pPr>
         <w:pStyle w:val="Heading1"/>
@@ -4112,7 +4163,7 @@
         <w:t xml:space="preserve">Usage Notes</w:t>
       </w:r>
     </w:p>
-    <w:bookmarkStart w:id="36" w:name="recommended-use-cases"/>
+    <w:bookmarkStart w:id="38" w:name="recommended-use-cases"/>
     <w:p>
       <w:pPr>
         <w:pStyle w:val="Heading2"/>
@@ -4191,8 +4242,8 @@
         <w:t xml:space="preserve">Graduate-level teaching of panel data methods</w:t>
       </w:r>
     </w:p>
-    <w:bookmarkEnd w:id="36"/>
-    <w:bookmarkStart w:id="38" w:name="limitations-and-upgrade-path-v2-roadmap"/>
+    <w:bookmarkEnd w:id="38"/>
+    <w:bookmarkStart w:id="40" w:name="limitations-and-upgrade-path-v2-roadmap"/>
     <w:p>
       <w:pPr>
         <w:pStyle w:val="Heading2"/>
@@ -4222,7 +4273,7 @@
         <w:t xml:space="preserve">.</w:t>
       </w:r>
     </w:p>
-    <w:bookmarkStart w:id="37" w:name="tab:roadmap"/>
+    <w:bookmarkStart w:id="39" w:name="tab:roadmap"/>
     <w:p>
       <w:pPr>
         <w:pStyle w:val="TableCaption"/>
@@ -4488,9 +4539,9 @@
         </w:tc>
       </w:tr>
     </w:tbl>
-    <w:bookmarkEnd w:id="37"/>
-    <w:bookmarkEnd w:id="38"/>
-    <w:bookmarkStart w:id="39" w:name="citation"/>
+    <w:bookmarkEnd w:id="39"/>
+    <w:bookmarkEnd w:id="40"/>
+    <w:bookmarkStart w:id="41" w:name="citation"/>
     <w:p>
       <w:pPr>
         <w:pStyle w:val="Heading2"/>
@@ -4562,9 +4613,9 @@
         <w:t xml:space="preserve">. doi:[to be assigned]</w:t>
       </w:r>
     </w:p>
-    <w:bookmarkEnd w:id="39"/>
-    <w:bookmarkEnd w:id="40"/>
-    <w:bookmarkStart w:id="41" w:name="acknowledgements"/>
+    <w:bookmarkEnd w:id="41"/>
+    <w:bookmarkEnd w:id="42"/>
+    <w:bookmarkStart w:id="43" w:name="acknowledgements"/>
     <w:p>
       <w:pPr>
         <w:pStyle w:val="Heading1"/>
@@ -4580,11 +4631,11 @@
         <w:jc w:val="both"/>
       </w:pPr>
       <w:r>
-        <w:t xml:space="preserve">This research was supported by [funding information to be added].</w:t>
-      </w:r>
-    </w:p>
-    <w:bookmarkEnd w:id="41"/>
-    <w:bookmarkStart w:id="42" w:name="author-contributions"/>
+        <w:t xml:space="preserve">This research received no external funding.</w:t>
+      </w:r>
+    </w:p>
+    <w:bookmarkEnd w:id="43"/>
+    <w:bookmarkStart w:id="44" w:name="author-contributions"/>
     <w:p>
       <w:pPr>
         <w:pStyle w:val="Heading1"/>
@@ -4600,11 +4651,11 @@
         <w:jc w:val="both"/>
       </w:pPr>
       <w:r>
-        <w:t xml:space="preserve">[To be completed by authors]</w:t>
-      </w:r>
-    </w:p>
-    <w:bookmarkEnd w:id="42"/>
-    <w:bookmarkStart w:id="43" w:name="competing-interests"/>
+        <w:t xml:space="preserve">A.K. conceived the study, designed the methodology, collected the data, developed the preprocessing and analysis pipeline, performed the statistical validation, and wrote the manuscript. A.I. contributed to the study design, literature review, data interpretation, and manuscript revision. Both authors reviewed and approved the final manuscript.</w:t>
+      </w:r>
+    </w:p>
+    <w:bookmarkEnd w:id="44"/>
+    <w:bookmarkStart w:id="45" w:name="competing-interests"/>
     <w:p>
       <w:pPr>
         <w:pStyle w:val="Heading1"/>
@@ -4623,8 +4674,8 @@
         <w:t xml:space="preserve">The authors declare no competing interests.</w:t>
       </w:r>
     </w:p>
-    <w:bookmarkEnd w:id="43"/>
-    <w:bookmarkStart w:id="46" w:name="data-availability"/>
+    <w:bookmarkEnd w:id="45"/>
+    <w:bookmarkStart w:id="48" w:name="data-availability"/>
     <w:p>
       <w:pPr>
         <w:pStyle w:val="Heading1"/>
@@ -4645,7 +4696,7 @@
       <w:r>
         <w:t xml:space="preserve"> </w:t>
       </w:r>
-      <w:hyperlink r:id="rId13">
+      <w:hyperlink r:id="rId15">
         <w:r>
           <w:rPr>
             <w:rStyle w:val="Hyperlink"/>
@@ -5357,7 +5408,7 @@
       <w:r>
         <w:t xml:space="preserve"> </w:t>
       </w:r>
-      <w:hyperlink r:id="rId44">
+      <w:hyperlink r:id="rId46">
         <w:r>
           <w:rPr>
             <w:rStyle w:val="Hyperlink"/>
@@ -5383,7 +5434,7 @@
       <w:r>
         <w:t xml:space="preserve"> </w:t>
       </w:r>
-      <w:hyperlink r:id="rId45">
+      <w:hyperlink r:id="rId47">
         <w:r>
           <w:rPr>
             <w:rStyle w:val="Hyperlink"/>
@@ -5398,7 +5449,7 @@
         <w:t xml:space="preserve">(accessed 2026-07-02).</w:t>
       </w:r>
     </w:p>
-    <w:bookmarkEnd w:id="46"/>
+    <w:bookmarkEnd w:id="48"/>
     <w:sectPr>
       <w:footnotePr>
         <w:numRestart w:val="eachSect"/>
@@ -5425,6 +5476,56 @@
     <w:p>
       <w:r>
         <w:separator/>
+      </w:r>
+    </w:p>
+  </w:footnote>
+  <w:footnote w:id="9">
+    <w:p>
+      <w:pPr>
+        <w:pStyle w:val="FootnoteText"/>
+      </w:pPr>
+      <w:r>
+        <w:rPr>
+          <w:rStyle w:val="FootnoteReference"/>
+        </w:rPr>
+        <w:footnoteRef/>
+      </w:r>
+      <w:r>
+        <w:t xml:space="preserve"> </w:t>
+      </w:r>
+      <w:r>
+        <w:t xml:space="preserve">Corresponding author:</w:t>
+      </w:r>
+      <w:r>
+        <w:t xml:space="preserve"> </w:t>
+      </w:r>
+      <w:r>
+        <w:rPr>
+          <w:rStyle w:val="VerbatimChar"/>
+        </w:rPr>
+        <w:t xml:space="preserve">ali@unda.ac.id</w:t>
+      </w:r>
+    </w:p>
+  </w:footnote>
+  <w:footnote w:id="10">
+    <w:p>
+      <w:pPr>
+        <w:pStyle w:val="FootnoteText"/>
+      </w:pPr>
+      <w:r>
+        <w:rPr>
+          <w:rStyle w:val="FootnoteReference"/>
+        </w:rPr>
+        <w:footnoteRef/>
+      </w:r>
+      <w:r>
+        <w:t xml:space="preserve"> </w:t>
+      </w:r>
+      <w:r>
+        <w:rPr>
+          <w:rStyle w:val="VerbatimChar"/>
+        </w:rPr>
+        <w:t xml:space="preserve">andy@unda.ac.id</w:t>
       </w:r>
     </w:p>
   </w:footnote>

</xml_diff>

<commit_message>
Add Zenodo DOI: 10.5281/zenodo.21110404
All [to be assigned] replaced with actual DOI in .tex, .md, .docx

Co-Authored-By: Claude <noreply@anthropic.com>
</commit_message>
<xml_diff>
--- a/draft_manuscript.docx
+++ b/draft_manuscript.docx
@@ -991,7 +991,19 @@
         <w:jc w:val="both"/>
       </w:pPr>
       <w:r>
-        <w:t xml:space="preserve">The dataset is deposited on Zenodo (DOI [to be assigned upon publication]) under a CC-BY 4.0 licence and the source code is available on GitHub (</w:t>
+        <w:t xml:space="preserve">The dataset is deposited on Zenodo (DOI:</w:t>
+      </w:r>
+      <w:r>
+        <w:t xml:space="preserve"> </w:t>
+      </w:r>
+      <w:r>
+        <w:rPr>
+          <w:rStyle w:val="VerbatimChar"/>
+        </w:rPr>
+        <w:t xml:space="preserve">10.5281/zenodo.21110404</w:t>
+      </w:r>
+      <w:r>
+        <w:t xml:space="preserve">) under a CC-BY 4.0 licence and the source code is available on GitHub (</w:t>
       </w:r>
       <w:hyperlink r:id="rId15">
         <w:r>
@@ -4579,7 +4591,7 @@
         <w:t xml:space="preserve">Scientific Data</w:t>
       </w:r>
       <w:r>
-        <w:t xml:space="preserve">, [volume, year]. doi:[to be assigned]</w:t>
+        <w:t xml:space="preserve">, [volume, year]. doi:10.5281/zenodo.21110404</w:t>
       </w:r>
     </w:p>
     <w:p>
@@ -4610,7 +4622,7 @@
         <w:t xml:space="preserve">Zenodo</w:t>
       </w:r>
       <w:r>
-        <w:t xml:space="preserve">. doi:[to be assigned]</w:t>
+        <w:t xml:space="preserve">. doi:10.5281/zenodo.21110404</w:t>
       </w:r>
     </w:p>
     <w:bookmarkEnd w:id="41"/>
@@ -4691,7 +4703,7 @@
         <w:jc w:val="both"/>
       </w:pPr>
       <w:r>
-        <w:t xml:space="preserve">The dataset generated and analysed during the current study is available in the Zenodo repository, doi:[to be assigned], under a CC-BY 4.0 license. Source code for data acquisition, preprocessing, and validation is available at</w:t>
+        <w:t xml:space="preserve">The dataset generated and analysed during the current study is available in the Zenodo repository, doi:10.5281/zenodo.21110404, under a CC-BY 4.0 license. Source code for data acquisition, preprocessing, and validation is available at</w:t>
       </w:r>
       <w:r>
         <w:t xml:space="preserve"> </w:t>

</xml_diff>

<commit_message>
Add keywords to manuscript (all formats)
Keywords: Indonesia Stock Exchange, panel data, financial dataset,
emerging market, Sharia compliance, Tobin's Q

Co-Authored-By: Claude <noreply@anthropic.com>
</commit_message>
<xml_diff>
--- a/draft_manuscript.docx
+++ b/draft_manuscript.docx
@@ -181,6 +181,25 @@
       </w:r>
       <w:r>
         <w:t xml:space="preserve">Faculty of Business, Universitas Darwan Ali, Indonesia</w:t>
+      </w:r>
+    </w:p>
+    <w:p>
+      <w:pPr>
+        <w:pStyle w:val="BodyText"/>
+        <w:jc w:val="both"/>
+      </w:pPr>
+      <w:r>
+        <w:rPr>
+          <w:b/>
+          <w:bCs/>
+        </w:rPr>
+        <w:t xml:space="preserve">Keywords:</w:t>
+      </w:r>
+      <w:r>
+        <w:t xml:space="preserve"> </w:t>
+      </w:r>
+      <w:r>
+        <w:t xml:space="preserve">Indonesia Stock Exchange, panel data, financial dataset, emerging market, Sharia compliance, Tobin’s Q</w:t>
       </w:r>
     </w:p>
     <w:bookmarkStart w:id="11" w:name="background-summary"/>

</xml_diff>

<commit_message>
Add Zenodo record URL: https://zenodo.org/records/21110404
Co-Authored-By: Claude <noreply@anthropic.com>
</commit_message>
<xml_diff>
--- a/draft_manuscript.docx
+++ b/draft_manuscript.docx
@@ -994,7 +994,7 @@
     </w:p>
     <w:bookmarkEnd w:id="16"/>
     <w:bookmarkEnd w:id="17"/>
-    <w:bookmarkStart w:id="24" w:name="data-records"/>
+    <w:bookmarkStart w:id="25" w:name="data-records"/>
     <w:p>
       <w:pPr>
         <w:pStyle w:val="Heading1"/>
@@ -1010,7 +1010,18 @@
         <w:jc w:val="both"/>
       </w:pPr>
       <w:r>
-        <w:t xml:space="preserve">The dataset is deposited on Zenodo (DOI:</w:t>
+        <w:t xml:space="preserve">The dataset is deposited on Zenodo (</w:t>
+      </w:r>
+      <w:hyperlink r:id="rId18">
+        <w:r>
+          <w:rPr>
+            <w:rStyle w:val="Hyperlink"/>
+          </w:rPr>
+          <w:t xml:space="preserve">https://zenodo.org/records/21110404</w:t>
+        </w:r>
+      </w:hyperlink>
+      <w:r>
+        <w:t xml:space="preserve">, DOI:</w:t>
       </w:r>
       <w:r>
         <w:t xml:space="preserve"> </w:t>
@@ -1036,7 +1047,7 @@
         <w:t xml:space="preserve">). The repository includes the following files.</w:t>
       </w:r>
     </w:p>
-    <w:bookmarkStart w:id="19" w:name="primary-data-files"/>
+    <w:bookmarkStart w:id="20" w:name="primary-data-files"/>
     <w:p>
       <w:pPr>
         <w:pStyle w:val="Heading2"/>
@@ -1046,7 +1057,7 @@
         <w:t xml:space="preserve">Primary Data Files</w:t>
       </w:r>
     </w:p>
-    <w:bookmarkStart w:id="18" w:name="tab:datafiles"/>
+    <w:bookmarkStart w:id="19" w:name="tab:datafiles"/>
     <w:p>
       <w:pPr>
         <w:pStyle w:val="TableCaption"/>
@@ -1422,9 +1433,9 @@
         </w:tc>
       </w:tr>
     </w:tbl>
-    <w:bookmarkEnd w:id="18"/>
     <w:bookmarkEnd w:id="19"/>
-    <w:bookmarkStart w:id="21" w:name="documentation-files"/>
+    <w:bookmarkEnd w:id="20"/>
+    <w:bookmarkStart w:id="22" w:name="documentation-files"/>
     <w:p>
       <w:pPr>
         <w:pStyle w:val="Heading2"/>
@@ -1434,7 +1445,7 @@
         <w:t xml:space="preserve">Documentation Files</w:t>
       </w:r>
     </w:p>
-    <w:bookmarkStart w:id="20" w:name="tab:docfiles"/>
+    <w:bookmarkStart w:id="21" w:name="tab:docfiles"/>
     <w:p>
       <w:pPr>
         <w:pStyle w:val="TableCaption"/>
@@ -1638,9 +1649,9 @@
         </w:tc>
       </w:tr>
     </w:tbl>
-    <w:bookmarkEnd w:id="20"/>
     <w:bookmarkEnd w:id="21"/>
-    <w:bookmarkStart w:id="23" w:name="variable-definitions-panel-master"/>
+    <w:bookmarkEnd w:id="22"/>
+    <w:bookmarkStart w:id="24" w:name="variable-definitions-panel-master"/>
     <w:p>
       <w:pPr>
         <w:pStyle w:val="Heading2"/>
@@ -1650,7 +1661,7 @@
         <w:t xml:space="preserve">Variable Definitions (Panel Master)</w:t>
       </w:r>
     </w:p>
-    <w:bookmarkStart w:id="22" w:name="tab:variables"/>
+    <w:bookmarkStart w:id="23" w:name="tab:variables"/>
     <w:p>
       <w:pPr>
         <w:pStyle w:val="TableCaption"/>
@@ -2458,10 +2469,10 @@
         </w:tc>
       </w:tr>
     </w:tbl>
-    <w:bookmarkEnd w:id="22"/>
     <w:bookmarkEnd w:id="23"/>
     <w:bookmarkEnd w:id="24"/>
-    <w:bookmarkStart w:id="37" w:name="technical-validation"/>
+    <w:bookmarkEnd w:id="25"/>
+    <w:bookmarkStart w:id="38" w:name="technical-validation"/>
     <w:p>
       <w:pPr>
         <w:pStyle w:val="Heading1"/>
@@ -2483,7 +2494,7 @@
         <w:t xml:space="preserve">. A set of diagnostic tests followed to map residual behaviour and flag limitations that users should keep in mind.</w:t>
       </w:r>
     </w:p>
-    <w:bookmarkStart w:id="26" w:name="regression-specification"/>
+    <w:bookmarkStart w:id="27" w:name="regression-specification"/>
     <w:p>
       <w:pPr>
         <w:pStyle w:val="Heading2"/>
@@ -2686,8 +2697,8 @@
         <w:pStyle w:val="FirstParagraph"/>
         <w:jc w:val="both"/>
       </w:pPr>
-      <w:bookmarkStart w:id="25" w:name="eq:ols"/>
-      <w:bookmarkEnd w:id="25"/>
+      <w:bookmarkStart w:id="26" w:name="eq:ols"/>
+      <w:bookmarkEnd w:id="26"/>
     </w:p>
     <w:p>
       <w:pPr>
@@ -2712,8 +2723,8 @@
         <w:t xml:space="preserve">is proxied by the price-to-book ratio. Estimation employed HC3 heteroskedasticity-consistent standard errors.</w:t>
       </w:r>
     </w:p>
-    <w:bookmarkEnd w:id="26"/>
-    <w:bookmarkStart w:id="28" w:name="results"/>
+    <w:bookmarkEnd w:id="27"/>
+    <w:bookmarkStart w:id="29" w:name="results"/>
     <w:p>
       <w:pPr>
         <w:pStyle w:val="Heading2"/>
@@ -2723,7 +2734,7 @@
         <w:t xml:space="preserve">Results</w:t>
       </w:r>
     </w:p>
-    <w:bookmarkStart w:id="27" w:name="tab:ols"/>
+    <w:bookmarkStart w:id="28" w:name="tab:ols"/>
     <w:p>
       <w:pPr>
         <w:pStyle w:val="TableCaption"/>
@@ -3421,7 +3432,7 @@
         </w:tc>
       </w:tr>
     </w:tbl>
-    <w:bookmarkEnd w:id="27"/>
+    <w:bookmarkEnd w:id="28"/>
     <w:p>
       <w:pPr>
         <w:pStyle w:val="BodyText"/>
@@ -3463,8 +3474,8 @@
         <w:t xml:space="preserve">.</w:t>
       </w:r>
     </w:p>
-    <w:bookmarkEnd w:id="28"/>
-    <w:bookmarkStart w:id="30" w:name="diagnostic-tests"/>
+    <w:bookmarkEnd w:id="29"/>
+    <w:bookmarkStart w:id="31" w:name="diagnostic-tests"/>
     <w:p>
       <w:pPr>
         <w:pStyle w:val="Heading2"/>
@@ -3474,7 +3485,7 @@
         <w:t xml:space="preserve">Diagnostic Tests</w:t>
       </w:r>
     </w:p>
-    <w:bookmarkStart w:id="29" w:name="tab:diag"/>
+    <w:bookmarkStart w:id="30" w:name="tab:diag"/>
     <w:p>
       <w:pPr>
         <w:pStyle w:val="TableCaption"/>
@@ -3944,9 +3955,9 @@
         </w:tc>
       </w:tr>
     </w:tbl>
-    <w:bookmarkEnd w:id="29"/>
     <w:bookmarkEnd w:id="30"/>
-    <w:bookmarkStart w:id="31" w:name="robustness-checks"/>
+    <w:bookmarkEnd w:id="31"/>
+    <w:bookmarkStart w:id="32" w:name="robustness-checks"/>
     <w:p>
       <w:pPr>
         <w:pStyle w:val="Heading2"/>
@@ -4030,8 +4041,8 @@
         <w:t xml:space="preserve">: Residuals vary noticeably by sector. Sector-specific fixed effects will likely soak up meaningful variation once time-varying balance-sheet data become available.</w:t>
       </w:r>
     </w:p>
-    <w:bookmarkEnd w:id="31"/>
-    <w:bookmarkStart w:id="34" w:name="known-limitations-v1"/>
+    <w:bookmarkEnd w:id="32"/>
+    <w:bookmarkStart w:id="35" w:name="known-limitations-v1"/>
     <w:p>
       <w:pPr>
         <w:pStyle w:val="Heading2"/>
@@ -4116,7 +4127,7 @@
       <w:r>
         <w:t xml:space="preserve">: BI Rate, inflation, GDP growth, and exchange-rate series are deferred to v2. They can be sourced from BI (</w:t>
       </w:r>
-      <w:hyperlink r:id="rId32">
+      <w:hyperlink r:id="rId33">
         <w:r>
           <w:rPr>
             <w:rStyle w:val="Hyperlink"/>
@@ -4127,7 +4138,7 @@
       <w:r>
         <w:t xml:space="preserve">) and BPS (</w:t>
       </w:r>
-      <w:hyperlink r:id="rId33">
+      <w:hyperlink r:id="rId34">
         <w:r>
           <w:rPr>
             <w:rStyle w:val="Hyperlink"/>
@@ -4139,8 +4150,8 @@
         <w:t xml:space="preserve">).</w:t>
       </w:r>
     </w:p>
-    <w:bookmarkEnd w:id="34"/>
-    <w:bookmarkStart w:id="35" w:name="panel-model-limitations"/>
+    <w:bookmarkEnd w:id="35"/>
+    <w:bookmarkStart w:id="36" w:name="panel-model-limitations"/>
     <w:p>
       <w:pPr>
         <w:pStyle w:val="Heading2"/>
@@ -4159,8 +4170,8 @@
         <w:t xml:space="preserve">Because v1 draws its financial ratios from a single point-in-time snapshot, within-firm variation never enters the picture. Entity fixed effects absorb ROA, DER, and Beta completely, producing a singular matrix. Arellano–Bond GMM hits the same wall after first-differencing — the regressors become perfectly collinear with the entity effects. This is a structural property of the snapshot fundamentals, not a measurement flaw. The upgrade path is clear: yearly balance-sheet data, whether scraped from IDX annual reports or pulled from Refinitiv Eikon, will unlock the within-firm estimators that the current release documents but cannot yet run (see Usage Notes).</w:t>
       </w:r>
     </w:p>
-    <w:bookmarkEnd w:id="35"/>
-    <w:bookmarkStart w:id="36" w:name="sharia-classification-method"/>
+    <w:bookmarkEnd w:id="36"/>
+    <w:bookmarkStart w:id="37" w:name="sharia-classification-method"/>
     <w:p>
       <w:pPr>
         <w:pStyle w:val="Heading2"/>
@@ -4182,9 +4193,9 @@
         <w:t xml:space="preserve">; v2 will adopt the same approach.</w:t>
       </w:r>
     </w:p>
-    <w:bookmarkEnd w:id="36"/>
     <w:bookmarkEnd w:id="37"/>
-    <w:bookmarkStart w:id="42" w:name="usage-notes"/>
+    <w:bookmarkEnd w:id="38"/>
+    <w:bookmarkStart w:id="43" w:name="usage-notes"/>
     <w:p>
       <w:pPr>
         <w:pStyle w:val="Heading1"/>
@@ -4194,7 +4205,7 @@
         <w:t xml:space="preserve">Usage Notes</w:t>
       </w:r>
     </w:p>
-    <w:bookmarkStart w:id="38" w:name="recommended-use-cases"/>
+    <w:bookmarkStart w:id="39" w:name="recommended-use-cases"/>
     <w:p>
       <w:pPr>
         <w:pStyle w:val="Heading2"/>
@@ -4273,8 +4284,8 @@
         <w:t xml:space="preserve">Graduate-level teaching of panel data methods</w:t>
       </w:r>
     </w:p>
-    <w:bookmarkEnd w:id="38"/>
-    <w:bookmarkStart w:id="40" w:name="limitations-and-upgrade-path-v2-roadmap"/>
+    <w:bookmarkEnd w:id="39"/>
+    <w:bookmarkStart w:id="41" w:name="limitations-and-upgrade-path-v2-roadmap"/>
     <w:p>
       <w:pPr>
         <w:pStyle w:val="Heading2"/>
@@ -4304,7 +4315,7 @@
         <w:t xml:space="preserve">.</w:t>
       </w:r>
     </w:p>
-    <w:bookmarkStart w:id="39" w:name="tab:roadmap"/>
+    <w:bookmarkStart w:id="40" w:name="tab:roadmap"/>
     <w:p>
       <w:pPr>
         <w:pStyle w:val="TableCaption"/>
@@ -4570,9 +4581,9 @@
         </w:tc>
       </w:tr>
     </w:tbl>
-    <w:bookmarkEnd w:id="39"/>
     <w:bookmarkEnd w:id="40"/>
-    <w:bookmarkStart w:id="41" w:name="citation"/>
+    <w:bookmarkEnd w:id="41"/>
+    <w:bookmarkStart w:id="42" w:name="citation"/>
     <w:p>
       <w:pPr>
         <w:pStyle w:val="Heading2"/>
@@ -4641,12 +4652,23 @@
         <w:t xml:space="preserve">Zenodo</w:t>
       </w:r>
       <w:r>
-        <w:t xml:space="preserve">. doi:10.5281/zenodo.21110404</w:t>
-      </w:r>
-    </w:p>
-    <w:bookmarkEnd w:id="41"/>
+        <w:t xml:space="preserve">.</w:t>
+      </w:r>
+      <w:r>
+        <w:t xml:space="preserve"> </w:t>
+      </w:r>
+      <w:hyperlink r:id="rId18">
+        <w:r>
+          <w:rPr>
+            <w:rStyle w:val="Hyperlink"/>
+          </w:rPr>
+          <w:t xml:space="preserve">https://zenodo.org/records/21110404</w:t>
+        </w:r>
+      </w:hyperlink>
+    </w:p>
     <w:bookmarkEnd w:id="42"/>
-    <w:bookmarkStart w:id="43" w:name="acknowledgements"/>
+    <w:bookmarkEnd w:id="43"/>
+    <w:bookmarkStart w:id="44" w:name="acknowledgements"/>
     <w:p>
       <w:pPr>
         <w:pStyle w:val="Heading1"/>
@@ -4665,8 +4687,8 @@
         <w:t xml:space="preserve">This research received no external funding.</w:t>
       </w:r>
     </w:p>
-    <w:bookmarkEnd w:id="43"/>
-    <w:bookmarkStart w:id="44" w:name="author-contributions"/>
+    <w:bookmarkEnd w:id="44"/>
+    <w:bookmarkStart w:id="45" w:name="author-contributions"/>
     <w:p>
       <w:pPr>
         <w:pStyle w:val="Heading1"/>
@@ -4685,8 +4707,8 @@
         <w:t xml:space="preserve">A.K. conceived the study, designed the methodology, collected the data, developed the preprocessing and analysis pipeline, performed the statistical validation, and wrote the manuscript. A.I. contributed to the study design, literature review, data interpretation, and manuscript revision. Both authors reviewed and approved the final manuscript.</w:t>
       </w:r>
     </w:p>
-    <w:bookmarkEnd w:id="44"/>
-    <w:bookmarkStart w:id="45" w:name="competing-interests"/>
+    <w:bookmarkEnd w:id="45"/>
+    <w:bookmarkStart w:id="46" w:name="competing-interests"/>
     <w:p>
       <w:pPr>
         <w:pStyle w:val="Heading1"/>
@@ -4705,8 +4727,8 @@
         <w:t xml:space="preserve">The authors declare no competing interests.</w:t>
       </w:r>
     </w:p>
-    <w:bookmarkEnd w:id="45"/>
-    <w:bookmarkStart w:id="48" w:name="data-availability"/>
+    <w:bookmarkEnd w:id="46"/>
+    <w:bookmarkStart w:id="49" w:name="data-availability"/>
     <w:p>
       <w:pPr>
         <w:pStyle w:val="Heading1"/>
@@ -5439,7 +5461,7 @@
       <w:r>
         <w:t xml:space="preserve"> </w:t>
       </w:r>
-      <w:hyperlink r:id="rId46">
+      <w:hyperlink r:id="rId47">
         <w:r>
           <w:rPr>
             <w:rStyle w:val="Hyperlink"/>
@@ -5465,7 +5487,7 @@
       <w:r>
         <w:t xml:space="preserve"> </w:t>
       </w:r>
-      <w:hyperlink r:id="rId47">
+      <w:hyperlink r:id="rId48">
         <w:r>
           <w:rPr>
             <w:rStyle w:val="Hyperlink"/>
@@ -5480,7 +5502,7 @@
         <w:t xml:space="preserve">(accessed 2026-07-02).</w:t>
       </w:r>
     </w:p>
-    <w:bookmarkEnd w:id="48"/>
+    <w:bookmarkEnd w:id="49"/>
     <w:sectPr>
       <w:footnotePr>
         <w:numRestart w:val="eachSect"/>

</xml_diff>

<commit_message>
Replace [Authors] with actual names: Kesuma & Ismail
Co-Authored-By: Claude <noreply@anthropic.com>
</commit_message>
<xml_diff>
--- a/draft_manuscript.docx
+++ b/draft_manuscript.docx
@@ -4608,7 +4608,7 @@
         <w:jc w:val="both"/>
       </w:pPr>
       <w:r>
-        <w:t xml:space="preserve">[Authors]. A Panel Dataset of the Indonesia Stock Exchange: Prices, Fundamentals, and Sharia Classification (2010–2026).</w:t>
+        <w:t xml:space="preserve">Kesuma, A. &amp; Ismail, A. A Panel Dataset of the Indonesia Stock Exchange: Prices, Fundamentals, and Sharia Classification (2010–2026).</w:t>
       </w:r>
       <w:r>
         <w:t xml:space="preserve"> </w:t>
@@ -4639,7 +4639,7 @@
         <w:jc w:val="both"/>
       </w:pPr>
       <w:r>
-        <w:t xml:space="preserve">[Authors]. IDX Panel Dataset 2010–2026 [Dataset].</w:t>
+        <w:t xml:space="preserve">Kesuma, A. &amp; Ismail, A. IDX Panel Dataset 2010–2026 [Dataset].</w:t>
       </w:r>
       <w:r>
         <w:t xml:space="preserve"> </w:t>

</xml_diff>

<commit_message>
Fix margin overflow: move long URLs to footnotes
Co-Authored-By: Claude <noreply@anthropic.com>
</commit_message>
<xml_diff>
--- a/draft_manuscript.docx
+++ b/draft_manuscript.docx
@@ -352,7 +352,7 @@
       </w:r>
     </w:p>
     <w:bookmarkEnd w:id="11"/>
-    <w:bookmarkStart w:id="17" w:name="methods"/>
+    <w:bookmarkStart w:id="18" w:name="methods"/>
     <w:p>
       <w:pPr>
         <w:pStyle w:val="Heading1"/>
@@ -875,7 +875,7 @@
       </w:r>
     </w:p>
     <w:bookmarkEnd w:id="14"/>
-    <w:bookmarkStart w:id="16" w:name="code-availability"/>
+    <w:bookmarkStart w:id="17" w:name="code-availability"/>
     <w:p>
       <w:pPr>
         <w:pStyle w:val="Heading2"/>
@@ -891,21 +891,16 @@
         <w:jc w:val="both"/>
       </w:pPr>
       <w:r>
-        <w:t xml:space="preserve">All acquisition and preprocessing scripts are housed in a GitHub repository (deposited at</w:t>
-      </w:r>
-      <w:r>
-        <w:t xml:space="preserve"> </w:t>
-      </w:r>
-      <w:hyperlink r:id="rId15">
-        <w:r>
-          <w:rPr>
-            <w:rStyle w:val="Hyperlink"/>
-          </w:rPr>
-          <w:t xml:space="preserve">https://github.com/lensetek/idx-panel-data-descriptor</w:t>
-        </w:r>
-      </w:hyperlink>
-      <w:r>
-        <w:t xml:space="preserve">). The code runs on Python 3.11+ and relies on</w:t>
+        <w:t xml:space="preserve">All acquisition and preprocessing scripts are housed in a GitHub repository</w:t>
+      </w:r>
+      <w:r>
+        <w:rPr>
+          <w:rStyle w:val="FootnoteReference"/>
+        </w:rPr>
+        <w:footnoteReference w:id="15"/>
+      </w:r>
+      <w:r>
+        <w:t xml:space="preserve">. The code runs on Python 3.11+ and relies on</w:t>
       </w:r>
       <w:r>
         <w:t xml:space="preserve"> </w:t>
@@ -992,9 +987,9 @@
         <w:t xml:space="preserve">.</w:t>
       </w:r>
     </w:p>
-    <w:bookmarkEnd w:id="16"/>
     <w:bookmarkEnd w:id="17"/>
-    <w:bookmarkStart w:id="25" w:name="data-records"/>
+    <w:bookmarkEnd w:id="18"/>
+    <w:bookmarkStart w:id="28" w:name="data-records"/>
     <w:p>
       <w:pPr>
         <w:pStyle w:val="Heading1"/>
@@ -1010,18 +1005,19 @@
         <w:jc w:val="both"/>
       </w:pPr>
       <w:r>
-        <w:t xml:space="preserve">The dataset is deposited on Zenodo (</w:t>
-      </w:r>
-      <w:hyperlink r:id="rId18">
-        <w:r>
-          <w:rPr>
-            <w:rStyle w:val="Hyperlink"/>
-          </w:rPr>
-          <w:t xml:space="preserve">https://zenodo.org/records/21110404</w:t>
-        </w:r>
-      </w:hyperlink>
-      <w:r>
-        <w:t xml:space="preserve">, DOI:</w:t>
+        <w:t xml:space="preserve">The dataset is deposited on Zenodo</w:t>
+      </w:r>
+      <w:r>
+        <w:rPr>
+          <w:rStyle w:val="FootnoteReference"/>
+        </w:rPr>
+        <w:footnoteReference w:id="19"/>
+      </w:r>
+      <w:r>
+        <w:t xml:space="preserve"> </w:t>
+      </w:r>
+      <w:r>
+        <w:t xml:space="preserve">(DOI:</w:t>
       </w:r>
       <w:r>
         <w:t xml:space="preserve"> </w:t>
@@ -1033,21 +1029,19 @@
         <w:t xml:space="preserve">10.5281/zenodo.21110404</w:t>
       </w:r>
       <w:r>
-        <w:t xml:space="preserve">) under a CC-BY 4.0 licence and the source code is available on GitHub (</w:t>
-      </w:r>
-      <w:hyperlink r:id="rId15">
-        <w:r>
-          <w:rPr>
-            <w:rStyle w:val="Hyperlink"/>
-          </w:rPr>
-          <w:t xml:space="preserve">https://github.com/lensetek/idx-panel-data-descriptor</w:t>
-        </w:r>
-      </w:hyperlink>
-      <w:r>
-        <w:t xml:space="preserve">). The repository includes the following files.</w:t>
-      </w:r>
-    </w:p>
-    <w:bookmarkStart w:id="20" w:name="primary-data-files"/>
+        <w:t xml:space="preserve">) under a CC-BY 4.0 licence and the source code is available on GitHub</w:t>
+      </w:r>
+      <w:r>
+        <w:rPr>
+          <w:rStyle w:val="FootnoteReference"/>
+        </w:rPr>
+        <w:footnoteReference w:id="21"/>
+      </w:r>
+      <w:r>
+        <w:t xml:space="preserve">. The repository includes the following files.</w:t>
+      </w:r>
+    </w:p>
+    <w:bookmarkStart w:id="23" w:name="primary-data-files"/>
     <w:p>
       <w:pPr>
         <w:pStyle w:val="Heading2"/>
@@ -1057,7 +1051,7 @@
         <w:t xml:space="preserve">Primary Data Files</w:t>
       </w:r>
     </w:p>
-    <w:bookmarkStart w:id="19" w:name="tab:datafiles"/>
+    <w:bookmarkStart w:id="22" w:name="tab:datafiles"/>
     <w:p>
       <w:pPr>
         <w:pStyle w:val="TableCaption"/>
@@ -1433,9 +1427,9 @@
         </w:tc>
       </w:tr>
     </w:tbl>
-    <w:bookmarkEnd w:id="19"/>
-    <w:bookmarkEnd w:id="20"/>
-    <w:bookmarkStart w:id="22" w:name="documentation-files"/>
+    <w:bookmarkEnd w:id="22"/>
+    <w:bookmarkEnd w:id="23"/>
+    <w:bookmarkStart w:id="25" w:name="documentation-files"/>
     <w:p>
       <w:pPr>
         <w:pStyle w:val="Heading2"/>
@@ -1445,7 +1439,7 @@
         <w:t xml:space="preserve">Documentation Files</w:t>
       </w:r>
     </w:p>
-    <w:bookmarkStart w:id="21" w:name="tab:docfiles"/>
+    <w:bookmarkStart w:id="24" w:name="tab:docfiles"/>
     <w:p>
       <w:pPr>
         <w:pStyle w:val="TableCaption"/>
@@ -1649,9 +1643,9 @@
         </w:tc>
       </w:tr>
     </w:tbl>
-    <w:bookmarkEnd w:id="21"/>
-    <w:bookmarkEnd w:id="22"/>
-    <w:bookmarkStart w:id="24" w:name="variable-definitions-panel-master"/>
+    <w:bookmarkEnd w:id="24"/>
+    <w:bookmarkEnd w:id="25"/>
+    <w:bookmarkStart w:id="27" w:name="variable-definitions-panel-master"/>
     <w:p>
       <w:pPr>
         <w:pStyle w:val="Heading2"/>
@@ -1661,7 +1655,7 @@
         <w:t xml:space="preserve">Variable Definitions (Panel Master)</w:t>
       </w:r>
     </w:p>
-    <w:bookmarkStart w:id="23" w:name="tab:variables"/>
+    <w:bookmarkStart w:id="26" w:name="tab:variables"/>
     <w:p>
       <w:pPr>
         <w:pStyle w:val="TableCaption"/>
@@ -2469,10 +2463,10 @@
         </w:tc>
       </w:tr>
     </w:tbl>
-    <w:bookmarkEnd w:id="23"/>
-    <w:bookmarkEnd w:id="24"/>
-    <w:bookmarkEnd w:id="25"/>
-    <w:bookmarkStart w:id="38" w:name="technical-validation"/>
+    <w:bookmarkEnd w:id="26"/>
+    <w:bookmarkEnd w:id="27"/>
+    <w:bookmarkEnd w:id="28"/>
+    <w:bookmarkStart w:id="41" w:name="technical-validation"/>
     <w:p>
       <w:pPr>
         <w:pStyle w:val="Heading1"/>
@@ -2494,7 +2488,7 @@
         <w:t xml:space="preserve">. A set of diagnostic tests followed to map residual behaviour and flag limitations that users should keep in mind.</w:t>
       </w:r>
     </w:p>
-    <w:bookmarkStart w:id="27" w:name="regression-specification"/>
+    <w:bookmarkStart w:id="30" w:name="regression-specification"/>
     <w:p>
       <w:pPr>
         <w:pStyle w:val="Heading2"/>
@@ -2697,8 +2691,8 @@
         <w:pStyle w:val="FirstParagraph"/>
         <w:jc w:val="both"/>
       </w:pPr>
-      <w:bookmarkStart w:id="26" w:name="eq:ols"/>
-      <w:bookmarkEnd w:id="26"/>
+      <w:bookmarkStart w:id="29" w:name="eq:ols"/>
+      <w:bookmarkEnd w:id="29"/>
     </w:p>
     <w:p>
       <w:pPr>
@@ -2723,8 +2717,8 @@
         <w:t xml:space="preserve">is proxied by the price-to-book ratio. Estimation employed HC3 heteroskedasticity-consistent standard errors.</w:t>
       </w:r>
     </w:p>
-    <w:bookmarkEnd w:id="27"/>
-    <w:bookmarkStart w:id="29" w:name="results"/>
+    <w:bookmarkEnd w:id="30"/>
+    <w:bookmarkStart w:id="32" w:name="results"/>
     <w:p>
       <w:pPr>
         <w:pStyle w:val="Heading2"/>
@@ -2734,7 +2728,7 @@
         <w:t xml:space="preserve">Results</w:t>
       </w:r>
     </w:p>
-    <w:bookmarkStart w:id="28" w:name="tab:ols"/>
+    <w:bookmarkStart w:id="31" w:name="tab:ols"/>
     <w:p>
       <w:pPr>
         <w:pStyle w:val="TableCaption"/>
@@ -3432,7 +3426,7 @@
         </w:tc>
       </w:tr>
     </w:tbl>
-    <w:bookmarkEnd w:id="28"/>
+    <w:bookmarkEnd w:id="31"/>
     <w:p>
       <w:pPr>
         <w:pStyle w:val="BodyText"/>
@@ -3474,8 +3468,8 @@
         <w:t xml:space="preserve">.</w:t>
       </w:r>
     </w:p>
-    <w:bookmarkEnd w:id="29"/>
-    <w:bookmarkStart w:id="31" w:name="diagnostic-tests"/>
+    <w:bookmarkEnd w:id="32"/>
+    <w:bookmarkStart w:id="34" w:name="diagnostic-tests"/>
     <w:p>
       <w:pPr>
         <w:pStyle w:val="Heading2"/>
@@ -3485,7 +3479,7 @@
         <w:t xml:space="preserve">Diagnostic Tests</w:t>
       </w:r>
     </w:p>
-    <w:bookmarkStart w:id="30" w:name="tab:diag"/>
+    <w:bookmarkStart w:id="33" w:name="tab:diag"/>
     <w:p>
       <w:pPr>
         <w:pStyle w:val="TableCaption"/>
@@ -3955,9 +3949,9 @@
         </w:tc>
       </w:tr>
     </w:tbl>
-    <w:bookmarkEnd w:id="30"/>
-    <w:bookmarkEnd w:id="31"/>
-    <w:bookmarkStart w:id="32" w:name="robustness-checks"/>
+    <w:bookmarkEnd w:id="33"/>
+    <w:bookmarkEnd w:id="34"/>
+    <w:bookmarkStart w:id="35" w:name="robustness-checks"/>
     <w:p>
       <w:pPr>
         <w:pStyle w:val="Heading2"/>
@@ -4041,8 +4035,8 @@
         <w:t xml:space="preserve">: Residuals vary noticeably by sector. Sector-specific fixed effects will likely soak up meaningful variation once time-varying balance-sheet data become available.</w:t>
       </w:r>
     </w:p>
-    <w:bookmarkEnd w:id="32"/>
-    <w:bookmarkStart w:id="35" w:name="known-limitations-v1"/>
+    <w:bookmarkEnd w:id="35"/>
+    <w:bookmarkStart w:id="38" w:name="known-limitations-v1"/>
     <w:p>
       <w:pPr>
         <w:pStyle w:val="Heading2"/>
@@ -4127,7 +4121,7 @@
       <w:r>
         <w:t xml:space="preserve">: BI Rate, inflation, GDP growth, and exchange-rate series are deferred to v2. They can be sourced from BI (</w:t>
       </w:r>
-      <w:hyperlink r:id="rId33">
+      <w:hyperlink r:id="rId36">
         <w:r>
           <w:rPr>
             <w:rStyle w:val="Hyperlink"/>
@@ -4138,7 +4132,7 @@
       <w:r>
         <w:t xml:space="preserve">) and BPS (</w:t>
       </w:r>
-      <w:hyperlink r:id="rId34">
+      <w:hyperlink r:id="rId37">
         <w:r>
           <w:rPr>
             <w:rStyle w:val="Hyperlink"/>
@@ -4150,8 +4144,8 @@
         <w:t xml:space="preserve">).</w:t>
       </w:r>
     </w:p>
-    <w:bookmarkEnd w:id="35"/>
-    <w:bookmarkStart w:id="36" w:name="panel-model-limitations"/>
+    <w:bookmarkEnd w:id="38"/>
+    <w:bookmarkStart w:id="39" w:name="panel-model-limitations"/>
     <w:p>
       <w:pPr>
         <w:pStyle w:val="Heading2"/>
@@ -4170,8 +4164,8 @@
         <w:t xml:space="preserve">Because v1 draws its financial ratios from a single point-in-time snapshot, within-firm variation never enters the picture. Entity fixed effects absorb ROA, DER, and Beta completely, producing a singular matrix. Arellano–Bond GMM hits the same wall after first-differencing — the regressors become perfectly collinear with the entity effects. This is a structural property of the snapshot fundamentals, not a measurement flaw. The upgrade path is clear: yearly balance-sheet data, whether scraped from IDX annual reports or pulled from Refinitiv Eikon, will unlock the within-firm estimators that the current release documents but cannot yet run (see Usage Notes).</w:t>
       </w:r>
     </w:p>
-    <w:bookmarkEnd w:id="36"/>
-    <w:bookmarkStart w:id="37" w:name="sharia-classification-method"/>
+    <w:bookmarkEnd w:id="39"/>
+    <w:bookmarkStart w:id="40" w:name="sharia-classification-method"/>
     <w:p>
       <w:pPr>
         <w:pStyle w:val="Heading2"/>
@@ -4193,9 +4187,9 @@
         <w:t xml:space="preserve">; v2 will adopt the same approach.</w:t>
       </w:r>
     </w:p>
-    <w:bookmarkEnd w:id="37"/>
-    <w:bookmarkEnd w:id="38"/>
-    <w:bookmarkStart w:id="43" w:name="usage-notes"/>
+    <w:bookmarkEnd w:id="40"/>
+    <w:bookmarkEnd w:id="41"/>
+    <w:bookmarkStart w:id="46" w:name="usage-notes"/>
     <w:p>
       <w:pPr>
         <w:pStyle w:val="Heading1"/>
@@ -4205,7 +4199,7 @@
         <w:t xml:space="preserve">Usage Notes</w:t>
       </w:r>
     </w:p>
-    <w:bookmarkStart w:id="39" w:name="recommended-use-cases"/>
+    <w:bookmarkStart w:id="42" w:name="recommended-use-cases"/>
     <w:p>
       <w:pPr>
         <w:pStyle w:val="Heading2"/>
@@ -4284,8 +4278,8 @@
         <w:t xml:space="preserve">Graduate-level teaching of panel data methods</w:t>
       </w:r>
     </w:p>
-    <w:bookmarkEnd w:id="39"/>
-    <w:bookmarkStart w:id="41" w:name="limitations-and-upgrade-path-v2-roadmap"/>
+    <w:bookmarkEnd w:id="42"/>
+    <w:bookmarkStart w:id="44" w:name="limitations-and-upgrade-path-v2-roadmap"/>
     <w:p>
       <w:pPr>
         <w:pStyle w:val="Heading2"/>
@@ -4315,7 +4309,7 @@
         <w:t xml:space="preserve">.</w:t>
       </w:r>
     </w:p>
-    <w:bookmarkStart w:id="40" w:name="tab:roadmap"/>
+    <w:bookmarkStart w:id="43" w:name="tab:roadmap"/>
     <w:p>
       <w:pPr>
         <w:pStyle w:val="TableCaption"/>
@@ -4581,9 +4575,9 @@
         </w:tc>
       </w:tr>
     </w:tbl>
-    <w:bookmarkEnd w:id="40"/>
-    <w:bookmarkEnd w:id="41"/>
-    <w:bookmarkStart w:id="42" w:name="citation"/>
+    <w:bookmarkEnd w:id="43"/>
+    <w:bookmarkEnd w:id="44"/>
+    <w:bookmarkStart w:id="45" w:name="citation"/>
     <w:p>
       <w:pPr>
         <w:pStyle w:val="Heading2"/>
@@ -4657,7 +4651,7 @@
       <w:r>
         <w:t xml:space="preserve"> </w:t>
       </w:r>
-      <w:hyperlink r:id="rId18">
+      <w:hyperlink r:id="rId20">
         <w:r>
           <w:rPr>
             <w:rStyle w:val="Hyperlink"/>
@@ -4666,9 +4660,9 @@
         </w:r>
       </w:hyperlink>
     </w:p>
-    <w:bookmarkEnd w:id="42"/>
-    <w:bookmarkEnd w:id="43"/>
-    <w:bookmarkStart w:id="44" w:name="acknowledgements"/>
+    <w:bookmarkEnd w:id="45"/>
+    <w:bookmarkEnd w:id="46"/>
+    <w:bookmarkStart w:id="47" w:name="acknowledgements"/>
     <w:p>
       <w:pPr>
         <w:pStyle w:val="Heading1"/>
@@ -4687,8 +4681,8 @@
         <w:t xml:space="preserve">This research received no external funding.</w:t>
       </w:r>
     </w:p>
-    <w:bookmarkEnd w:id="44"/>
-    <w:bookmarkStart w:id="45" w:name="author-contributions"/>
+    <w:bookmarkEnd w:id="47"/>
+    <w:bookmarkStart w:id="48" w:name="author-contributions"/>
     <w:p>
       <w:pPr>
         <w:pStyle w:val="Heading1"/>
@@ -4707,8 +4701,8 @@
         <w:t xml:space="preserve">A.K. conceived the study, designed the methodology, collected the data, developed the preprocessing and analysis pipeline, performed the statistical validation, and wrote the manuscript. A.I. contributed to the study design, literature review, data interpretation, and manuscript revision. Both authors reviewed and approved the final manuscript.</w:t>
       </w:r>
     </w:p>
-    <w:bookmarkEnd w:id="45"/>
-    <w:bookmarkStart w:id="46" w:name="competing-interests"/>
+    <w:bookmarkEnd w:id="48"/>
+    <w:bookmarkStart w:id="49" w:name="competing-interests"/>
     <w:p>
       <w:pPr>
         <w:pStyle w:val="Heading1"/>
@@ -4727,8 +4721,8 @@
         <w:t xml:space="preserve">The authors declare no competing interests.</w:t>
       </w:r>
     </w:p>
-    <w:bookmarkEnd w:id="46"/>
-    <w:bookmarkStart w:id="49" w:name="data-availability"/>
+    <w:bookmarkEnd w:id="49"/>
+    <w:bookmarkStart w:id="54" w:name="data-availability"/>
     <w:p>
       <w:pPr>
         <w:pStyle w:val="Heading1"/>
@@ -4744,19 +4738,26 @@
         <w:jc w:val="both"/>
       </w:pPr>
       <w:r>
-        <w:t xml:space="preserve">The dataset generated and analysed during the current study is available in the Zenodo repository, doi:10.5281/zenodo.21110404, under a CC-BY 4.0 license. Source code for data acquisition, preprocessing, and validation is available at</w:t>
-      </w:r>
-      <w:r>
-        <w:t xml:space="preserve"> </w:t>
-      </w:r>
-      <w:hyperlink r:id="rId15">
-        <w:r>
-          <w:rPr>
-            <w:rStyle w:val="Hyperlink"/>
-          </w:rPr>
-          <w:t xml:space="preserve">https://github.com/lensetek/idx-panel-data-descriptor</w:t>
-        </w:r>
-      </w:hyperlink>
+        <w:t xml:space="preserve">The dataset generated and analysed during the current study is available in the Zenodo repository</w:t>
+      </w:r>
+      <w:r>
+        <w:rPr>
+          <w:rStyle w:val="FootnoteReference"/>
+        </w:rPr>
+        <w:footnoteReference w:id="50"/>
+      </w:r>
+      <w:r>
+        <w:t xml:space="preserve"> </w:t>
+      </w:r>
+      <w:r>
+        <w:t xml:space="preserve">(DOI: 10.5281/zenodo.21110404) under a CC-BY 4.0 license. Source code for data acquisition, preprocessing, and validation is available on GitHub</w:t>
+      </w:r>
+      <w:r>
+        <w:rPr>
+          <w:rStyle w:val="FootnoteReference"/>
+        </w:rPr>
+        <w:footnoteReference w:id="51"/>
+      </w:r>
       <w:r>
         <w:t xml:space="preserve">. All data were collected from publicly accessible sources as described in the Methods section.</w:t>
       </w:r>
@@ -5461,7 +5462,7 @@
       <w:r>
         <w:t xml:space="preserve"> </w:t>
       </w:r>
-      <w:hyperlink r:id="rId47">
+      <w:hyperlink r:id="rId52">
         <w:r>
           <w:rPr>
             <w:rStyle w:val="Hyperlink"/>
@@ -5487,7 +5488,7 @@
       <w:r>
         <w:t xml:space="preserve"> </w:t>
       </w:r>
-      <w:hyperlink r:id="rId48">
+      <w:hyperlink r:id="rId53">
         <w:r>
           <w:rPr>
             <w:rStyle w:val="Hyperlink"/>
@@ -5502,7 +5503,7 @@
         <w:t xml:space="preserve">(accessed 2026-07-02).</w:t>
       </w:r>
     </w:p>
-    <w:bookmarkEnd w:id="49"/>
+    <w:bookmarkEnd w:id="54"/>
     <w:sectPr>
       <w:footnotePr>
         <w:numRestart w:val="eachSect"/>
@@ -5580,6 +5581,126 @@
         </w:rPr>
         <w:t xml:space="preserve">andy@unda.ac.id</w:t>
       </w:r>
+    </w:p>
+  </w:footnote>
+  <w:footnote w:id="15">
+    <w:p>
+      <w:pPr>
+        <w:pStyle w:val="FootnoteText"/>
+      </w:pPr>
+      <w:r>
+        <w:rPr>
+          <w:rStyle w:val="FootnoteReference"/>
+        </w:rPr>
+        <w:footnoteRef/>
+      </w:r>
+      <w:r>
+        <w:t xml:space="preserve"> </w:t>
+      </w:r>
+      <w:hyperlink r:id="rId16">
+        <w:r>
+          <w:rPr>
+            <w:rStyle w:val="Hyperlink"/>
+          </w:rPr>
+          <w:t xml:space="preserve">https://github.com/lensetek/idx-panel-data-descriptor</w:t>
+        </w:r>
+      </w:hyperlink>
+    </w:p>
+  </w:footnote>
+  <w:footnote w:id="19">
+    <w:p>
+      <w:pPr>
+        <w:pStyle w:val="FootnoteText"/>
+      </w:pPr>
+      <w:r>
+        <w:rPr>
+          <w:rStyle w:val="FootnoteReference"/>
+        </w:rPr>
+        <w:footnoteRef/>
+      </w:r>
+      <w:r>
+        <w:t xml:space="preserve"> </w:t>
+      </w:r>
+      <w:hyperlink r:id="rId20">
+        <w:r>
+          <w:rPr>
+            <w:rStyle w:val="Hyperlink"/>
+          </w:rPr>
+          <w:t xml:space="preserve">https://zenodo.org/records/21110404</w:t>
+        </w:r>
+      </w:hyperlink>
+    </w:p>
+  </w:footnote>
+  <w:footnote w:id="21">
+    <w:p>
+      <w:pPr>
+        <w:pStyle w:val="FootnoteText"/>
+      </w:pPr>
+      <w:r>
+        <w:rPr>
+          <w:rStyle w:val="FootnoteReference"/>
+        </w:rPr>
+        <w:footnoteRef/>
+      </w:r>
+      <w:r>
+        <w:t xml:space="preserve"> </w:t>
+      </w:r>
+      <w:hyperlink r:id="rId16">
+        <w:r>
+          <w:rPr>
+            <w:rStyle w:val="Hyperlink"/>
+          </w:rPr>
+          <w:t xml:space="preserve">https://github.com/lensetek/idx-panel-data-descriptor</w:t>
+        </w:r>
+      </w:hyperlink>
+    </w:p>
+  </w:footnote>
+  <w:footnote w:id="50">
+    <w:p>
+      <w:pPr>
+        <w:pStyle w:val="FootnoteText"/>
+      </w:pPr>
+      <w:r>
+        <w:rPr>
+          <w:rStyle w:val="FootnoteReference"/>
+        </w:rPr>
+        <w:footnoteRef/>
+      </w:r>
+      <w:r>
+        <w:t xml:space="preserve"> </w:t>
+      </w:r>
+      <w:hyperlink r:id="rId20">
+        <w:r>
+          <w:rPr>
+            <w:rStyle w:val="Hyperlink"/>
+          </w:rPr>
+          <w:t xml:space="preserve">https://zenodo.org/records/21110404</w:t>
+        </w:r>
+      </w:hyperlink>
+    </w:p>
+  </w:footnote>
+  <w:footnote w:id="51">
+    <w:p>
+      <w:pPr>
+        <w:pStyle w:val="FootnoteText"/>
+      </w:pPr>
+      <w:r>
+        <w:rPr>
+          <w:rStyle w:val="FootnoteReference"/>
+        </w:rPr>
+        <w:footnoteRef/>
+      </w:r>
+      <w:r>
+        <w:t xml:space="preserve"> </w:t>
+      </w:r>
+      <w:hyperlink r:id="rId16">
+        <w:r>
+          <w:rPr>
+            <w:rStyle w:val="Hyperlink"/>
+          </w:rPr>
+          <w:t xml:space="preserve">https://github.com/lensetek/idx-panel-data-descriptor</w:t>
+        </w:r>
+      </w:hyperlink>
     </w:p>
   </w:footnote>
 </w:footnotes>

</xml_diff>

<commit_message>
Break long citation title across lines to fix margin overflow
Co-Authored-By: Claude <noreply@anthropic.com>
</commit_message>
<xml_diff>
--- a/draft_manuscript.docx
+++ b/draft_manuscript.docx
@@ -4602,10 +4602,16 @@
         <w:jc w:val="both"/>
       </w:pPr>
       <w:r>
-        <w:t xml:space="preserve">Kesuma, A. &amp; Ismail, A. A Panel Dataset of the Indonesia Stock Exchange: Prices, Fundamentals, and Sharia Classification (2010–2026).</w:t>
-      </w:r>
-      <w:r>
-        <w:t xml:space="preserve"> </w:t>
+        <w:t xml:space="preserve">Kesuma, A. &amp; Ismail, A. A Panel Dataset of the Indonesia Stock Exchange:</w:t>
+      </w:r>
+      <w:r>
+        <w:br/>
+      </w:r>
+      <w:r>
+        <w:t xml:space="preserve">Prices, Fundamentals, and Sharia Classification (2010–2026).</w:t>
+      </w:r>
+      <w:r>
+        <w:br/>
       </w:r>
       <w:r>
         <w:rPr>

</xml_diff>